<commit_message>
docs: update project report with system architecture, flowchart diagrams, and UI design details
</commit_message>
<xml_diff>
--- a/NMPA Port Digital Clearance System_Project_Report.docx
+++ b/NMPA Port Digital Clearance System_Project_Report.docx
@@ -916,6 +916,161 @@
         <w:br/>
         <w:t>4. Offline Fallback Layer: An Axios Mock Adapter intercepts REST API queries when network connectivity fails, falling back to the browser's LocalStorage to maintain port operations without interruption.</w:t>
       </w:r>
+    </w:p>
+    <w:p>
+      <w:pPr>
+        <w:pStyle w:val="Heading3"/>
+        <w:keepNext/>
+        <w:spacing w:before="280" w:after="120"/>
+      </w:pPr>
+      <w:r>
+        <w:rPr>
+          <w:rFonts w:ascii="Calibri" w:hAnsi="Calibri"/>
+          <w:b/>
+          <w:color w:val="374151"/>
+          <w:sz w:val="24"/>
+        </w:rPr>
+        <w:t>4.1.1 System Architecture Diagram</w:t>
+      </w:r>
+    </w:p>
+    <w:p>
+      <w:pPr>
+        <w:spacing w:after="160" w:line="276" w:lineRule="auto"/>
+      </w:pPr>
+      <w:r>
+        <w:rPr>
+          <w:rFonts w:ascii="Calibri" w:hAnsi="Calibri"/>
+          <w:color w:val="2D3748"/>
+          <w:sz w:val="22"/>
+        </w:rPr>
+        <w:t>The diagram below illustrates the layered architecture of the single-window clearance portal, detailing the interfaces and connectors between client, fallback mock database, application middleware, and data tier.</w:t>
+      </w:r>
+    </w:p>
+    <w:tbl>
+      <w:tblPr>
+        <w:tblW w:type="auto" w:w="0"/>
+        <w:jc w:val="center"/>
+        <w:tblLook w:firstColumn="1" w:firstRow="1" w:lastColumn="0" w:lastRow="0" w:noHBand="0" w:noVBand="1" w:val="04A0"/>
+      </w:tblPr>
+      <w:tblGrid>
+        <w:gridCol w:w="9360"/>
+      </w:tblGrid>
+      <w:tr>
+        <w:tc>
+          <w:tcPr>
+            <w:tcW w:type="dxa" w:w="9360"/>
+            <w:shd w:val="clear" w:color="auto" w:fill="F8FAFC"/>
+            <w:tcBorders>
+              <w:left w:val="single" w:sz="20" w:space="0" w:color="64748B"/>
+              <w:top w:val="none"/>
+              <w:bottom w:val="none"/>
+              <w:right w:val="none"/>
+            </w:tcBorders>
+            <w:tcMar>
+              <w:top w:w="120" w:type="dxa"/>
+              <w:bottom w:w="120" w:type="dxa"/>
+              <w:left w:w="180" w:type="dxa"/>
+              <w:right w:w="180" w:type="dxa"/>
+            </w:tcMar>
+          </w:tcPr>
+          <w:p>
+            <w:pPr>
+              <w:spacing w:after="0" w:line="240" w:lineRule="auto"/>
+            </w:pPr>
+            <w:r>
+              <w:rPr>
+                <w:rFonts w:ascii="Consolas" w:hAnsi="Consolas"/>
+                <w:color w:val="0F172A"/>
+                <w:sz w:val="17"/>
+              </w:rPr>
+              <w:t>+-----------------------------------------------------------------------------+</w:t>
+              <w:br/>
+              <w:t>|                                CLIENT LAYER                                 |</w:t>
+              <w:br/>
+              <w:t>|                                                                             |</w:t>
+              <w:br/>
+              <w:t>|  +--------------------+   +---------------------+   +--------------------+  |</w:t>
+              <w:br/>
+              <w:t>|  |     Ship Agent     |   | Department Officers |   |   Administration   |  |</w:t>
+              <w:br/>
+              <w:t>|  |     Dashboard      |   |  (PHO, Customs, TC) |   |    Control Panel   |  |</w:t>
+              <w:br/>
+              <w:t>|  +--------------------+   +---------------------+   +--------------------+  |</w:t>
+              <w:br/>
+              <w:t>|  |  React SPA (Vite) / Vanilla CSS (Responsive Grid, Glassmorphic Panels) |  |</w:t>
+              <w:br/>
+              <w:t>+----------------------------------------------------+------------------------+</w:t>
+              <w:br/>
+              <w:t xml:space="preserve">                                                     | (Intercepts Offline)</w:t>
+              <w:br/>
+              <w:t xml:space="preserve">                                                     v</w:t>
+              <w:br/>
+              <w:t xml:space="preserve">                                            +------------------+</w:t>
+              <w:br/>
+              <w:t xml:space="preserve">                                            |  OFFLINE LAYER   |</w:t>
+              <w:br/>
+              <w:t xml:space="preserve">                                            |  Axios Mock DB   |</w:t>
+              <w:br/>
+              <w:t xml:space="preserve">                                            |  (LocalStorage)  |</w:t>
+              <w:br/>
+              <w:t xml:space="preserve">                                            +------------------+</w:t>
+              <w:br/>
+              <w:t xml:space="preserve">                                                     |</w:t>
+              <w:br/>
+              <w:t xml:space="preserve">                                                     | REST APIs (HTTPS + JWT)</w:t>
+              <w:br/>
+              <w:t xml:space="preserve">                                                     v</w:t>
+              <w:br/>
+              <w:t>+-----------------------------------------------------------------------------+</w:t>
+              <w:br/>
+              <w:t>|                          APPLICATION SERVER LAYER                           |</w:t>
+              <w:br/>
+              <w:t>|                                                                             |</w:t>
+              <w:br/>
+              <w:t>|   +-------------------+    +--------------------+    +------------------+   |</w:t>
+              <w:br/>
+              <w:t>|   |  Auth Controller  |    |  Vessel Controller |    |  Clearance Flow  |   |</w:t>
+              <w:br/>
+              <w:t>|   |  (Bcrypt, TOTP)   |    |    (IMO Check)     |    | (State Machine)  |   |</w:t>
+              <w:br/>
+              <w:t>|   +-------------------+    +--------------------+    +------------------+   |</w:t>
+              <w:br/>
+              <w:t>|   |            Node.js / Express.js REST API Services &amp; Middleware          |</w:t>
+              <w:br/>
+              <w:t>+------------------------------------+----------------------------------------+</w:t>
+              <w:br/>
+              <w:t xml:space="preserve">                                     |</w:t>
+              <w:br/>
+              <w:t xml:space="preserve">                                     | Mongoose ODM (Secure TLS)</w:t>
+              <w:br/>
+              <w:t xml:space="preserve">                                     v</w:t>
+              <w:br/>
+              <w:t>+-----------------------------------------------------------------------------+</w:t>
+              <w:br/>
+              <w:t>|                               DATABASE LAYER                                |</w:t>
+              <w:br/>
+              <w:t>|                                                                             |</w:t>
+              <w:br/>
+              <w:t>|   +--------------------+   +--------------------+   +-------------------+   |</w:t>
+              <w:br/>
+              <w:t>|   |  Users Collection  |   | Vessels Collection |   | Voyage Clearance  |   |</w:t>
+              <w:br/>
+              <w:t>|   |   (Auth &amp; Secrets) |   |  (Uniqueness Index)|   |    (State Logs)   |</w:t>
+              <w:br/>
+              <w:t>|   +--------------------+   +--------------------+   +-------------------+   |</w:t>
+              <w:br/>
+              <w:t>|   |                        MongoDB Atlas Cloud Storage                      |</w:t>
+              <w:br/>
+              <w:t>+-----------------------------------------------------------------------------+</w:t>
+            </w:r>
+          </w:p>
+        </w:tc>
+      </w:tr>
+    </w:tbl>
+    <w:p>
+      <w:pPr>
+        <w:spacing w:before="120" w:after="120" w:line="240" w:lineRule="auto"/>
+      </w:pPr>
     </w:p>
     <w:p>
       <w:pPr>
@@ -4319,6 +4474,559 @@
       </w:pPr>
     </w:p>
     <w:p>
+      <w:pPr>
+        <w:pStyle w:val="Heading3"/>
+        <w:keepNext/>
+        <w:spacing w:before="280" w:after="120"/>
+      </w:pPr>
+      <w:r>
+        <w:rPr>
+          <w:rFonts w:ascii="Calibri" w:hAnsi="Calibri"/>
+          <w:b/>
+          <w:color w:val="374151"/>
+          <w:sz w:val="24"/>
+        </w:rPr>
+        <w:t>4.3.4 Visual Flow Chart Diagrams</w:t>
+      </w:r>
+    </w:p>
+    <w:p>
+      <w:pPr>
+        <w:spacing w:after="160" w:line="276" w:lineRule="auto"/>
+      </w:pPr>
+      <w:r>
+        <w:rPr>
+          <w:rFonts w:ascii="Calibri" w:hAnsi="Calibri"/>
+          <w:color w:val="2D3748"/>
+          <w:sz w:val="22"/>
+        </w:rPr>
+        <w:t>The ASCII flow chart diagram below details the state transitions and decision logic enforced by the Single Window Port Clearance pipeline across departments:</w:t>
+      </w:r>
+    </w:p>
+    <w:tbl>
+      <w:tblPr>
+        <w:tblW w:type="auto" w:w="0"/>
+        <w:jc w:val="center"/>
+        <w:tblLook w:firstColumn="1" w:firstRow="1" w:lastColumn="0" w:lastRow="0" w:noHBand="0" w:noVBand="1" w:val="04A0"/>
+      </w:tblPr>
+      <w:tblGrid>
+        <w:gridCol w:w="9360"/>
+      </w:tblGrid>
+      <w:tr>
+        <w:tc>
+          <w:tcPr>
+            <w:tcW w:type="dxa" w:w="9360"/>
+            <w:shd w:val="clear" w:color="auto" w:fill="F8FAFC"/>
+            <w:tcBorders>
+              <w:left w:val="single" w:sz="20" w:space="0" w:color="64748B"/>
+              <w:top w:val="none"/>
+              <w:bottom w:val="none"/>
+              <w:right w:val="none"/>
+            </w:tcBorders>
+            <w:tcMar>
+              <w:top w:w="120" w:type="dxa"/>
+              <w:bottom w:w="120" w:type="dxa"/>
+              <w:left w:w="180" w:type="dxa"/>
+              <w:right w:w="180" w:type="dxa"/>
+            </w:tcMar>
+          </w:tcPr>
+          <w:p>
+            <w:pPr>
+              <w:spacing w:after="0" w:line="240" w:lineRule="auto"/>
+            </w:pPr>
+            <w:r>
+              <w:rPr>
+                <w:rFonts w:ascii="Consolas" w:hAnsi="Consolas"/>
+                <w:color w:val="0F172A"/>
+                <w:sz w:val="17"/>
+              </w:rPr>
+              <w:t xml:space="preserve">                [ SHIP AGENT FILES CLEARANCE APPLICATION ]</w:t>
+              <w:br/>
+              <w:t xml:space="preserve">                                   |</w:t>
+              <w:br/>
+              <w:t xml:space="preserve">                                   v</w:t>
+              <w:br/>
+              <w:t xml:space="preserve">                      +-------------------------+</w:t>
+              <w:br/>
+              <w:t xml:space="preserve">                      |  Voyage Record Created  |</w:t>
+              <w:br/>
+              <w:t xml:space="preserve">                      |  State: PHO Pending     |</w:t>
+              <w:br/>
+              <w:t xml:space="preserve">                      +-------------------------+</w:t>
+              <w:br/>
+              <w:t xml:space="preserve">                                   |</w:t>
+              <w:br/>
+              <w:t xml:space="preserve">                                   v</w:t>
+              <w:br/>
+              <w:t xml:space="preserve">                     /---------------------------\</w:t>
+              <w:br/>
+              <w:t xml:space="preserve">                    /   Port Health Organisation  \</w:t>
+              <w:br/>
+              <w:t xml:space="preserve">                   (       Officer Approval?       )</w:t>
+              <w:br/>
+              <w:t xml:space="preserve">                    \                             /</w:t>
+              <w:br/>
+              <w:t xml:space="preserve">                     \---------------------------/</w:t>
+              <w:br/>
+              <w:t xml:space="preserve">                            |             |</w:t>
+              <w:br/>
+              <w:t xml:space="preserve">                        YES |             | NO</w:t>
+              <w:br/>
+              <w:t xml:space="preserve">                            v             v</w:t>
+              <w:br/>
+              <w:t xml:space="preserve">             +-------------------------+  +--------------------------+</w:t>
+              <w:br/>
+              <w:t xml:space="preserve">             | State: Customs Pending  |  | State: Voyage Rejected   |</w:t>
+              <w:br/>
+              <w:t xml:space="preserve">             +-------------------------+  | (Process Terminates)     |</w:t>
+              <w:br/>
+              <w:t xml:space="preserve">                            |             +--------------------------+</w:t>
+              <w:br/>
+              <w:t xml:space="preserve">                            v</w:t>
+              <w:br/>
+              <w:t xml:space="preserve">                     /---------------------------\</w:t>
+              <w:br/>
+              <w:t xml:space="preserve">                    /      Customs Department     \</w:t>
+              <w:br/>
+              <w:t xml:space="preserve">                   (        Officer Audit?        )</w:t>
+              <w:br/>
+              <w:t xml:space="preserve">                    \                             /</w:t>
+              <w:br/>
+              <w:t xml:space="preserve">                     \---------------------------/</w:t>
+              <w:br/>
+              <w:t xml:space="preserve">                            |             |</w:t>
+              <w:br/>
+              <w:t xml:space="preserve">                        YES |             | NO</w:t>
+              <w:br/>
+              <w:t xml:space="preserve">                            v             v</w:t>
+              <w:br/>
+              <w:t xml:space="preserve">             +-------------------------+  +--------------------------+</w:t>
+              <w:br/>
+              <w:t xml:space="preserve">             | State: Traffic Pending  |  | State: Voyage Rejected   |</w:t>
+              <w:br/>
+              <w:t xml:space="preserve">             +-------------------------+  | (Process Terminates)     |</w:t>
+              <w:br/>
+              <w:t xml:space="preserve">                            |             +--------------------------+</w:t>
+              <w:br/>
+              <w:t xml:space="preserve">                            v</w:t>
+              <w:br/>
+              <w:t xml:space="preserve">                     /---------------------------\</w:t>
+              <w:br/>
+              <w:t xml:space="preserve">                    /    Port Traffic Operations  \</w:t>
+              <w:br/>
+              <w:t xml:space="preserve">                   (     Controller Approval?     )</w:t>
+              <w:br/>
+              <w:t xml:space="preserve">                    \                             /</w:t>
+              <w:br/>
+              <w:t xml:space="preserve">                     \---------------------------/</w:t>
+              <w:br/>
+              <w:t xml:space="preserve">                            |             |</w:t>
+              <w:br/>
+              <w:t xml:space="preserve">                        YES |             | NO</w:t>
+              <w:br/>
+              <w:t xml:space="preserve">                            v             v</w:t>
+              <w:br/>
+              <w:t xml:space="preserve">             +-------------------------+  +--------------------------+</w:t>
+              <w:br/>
+              <w:t xml:space="preserve">             | State: Voyage Cleared   |  | State: Voyage Rejected   |</w:t>
+              <w:br/>
+              <w:t xml:space="preserve">             | (PDF Certificates Gen)  |  | (Process Terminates)     |</w:t>
+              <w:br/>
+              <w:t xml:space="preserve">             +-------------------------+  +--------------------------+</w:t>
+              <w:br/>
+              <w:t xml:space="preserve">                            |</w:t>
+              <w:br/>
+              <w:t xml:space="preserve">                            v</w:t>
+              <w:br/>
+              <w:t xml:space="preserve">               [ PUBLIC QR VERIFICATION CAPABLE ]</w:t>
+            </w:r>
+          </w:p>
+        </w:tc>
+      </w:tr>
+    </w:tbl>
+    <w:p>
+      <w:pPr>
+        <w:spacing w:before="120" w:after="120" w:line="240" w:lineRule="auto"/>
+      </w:pPr>
+    </w:p>
+    <w:p>
+      <w:pPr>
+        <w:pStyle w:val="Heading2"/>
+        <w:keepNext/>
+        <w:spacing w:before="280" w:after="120"/>
+      </w:pPr>
+      <w:r>
+        <w:rPr>
+          <w:rFonts w:ascii="Calibri" w:hAnsi="Calibri"/>
+          <w:b/>
+          <w:color w:val="0F766E"/>
+          <w:sz w:val="28"/>
+        </w:rPr>
+        <w:t>4.4 UI Design &amp; Aesthetics Specifications</w:t>
+      </w:r>
+    </w:p>
+    <w:p>
+      <w:pPr>
+        <w:spacing w:after="160" w:line="276" w:lineRule="auto"/>
+      </w:pPr>
+      <w:r>
+        <w:rPr>
+          <w:rFonts w:ascii="Calibri" w:hAnsi="Calibri"/>
+          <w:color w:val="2D3748"/>
+          <w:sz w:val="22"/>
+        </w:rPr>
+        <w:t>To ensure a modern, accessible, and responsive user experience, the system implements a premium custom design system without relying on heavy third-party framework classes. The design token and typography rules are defined below:</w:t>
+      </w:r>
+    </w:p>
+    <w:tbl>
+      <w:tblPr>
+        <w:tblW w:type="auto" w:w="0"/>
+        <w:jc w:val="center"/>
+        <w:tblLook w:firstColumn="1" w:firstRow="1" w:lastColumn="0" w:lastRow="0" w:noHBand="0" w:noVBand="1" w:val="04A0"/>
+        <w:tblBorders>
+          <w:top w:val="single" w:sz="4" w:space="0" w:color="D3D3D3"/>
+          <w:left w:val="single" w:sz="4" w:space="0" w:color="D3D3D3"/>
+          <w:bottom w:val="single" w:sz="4" w:space="0" w:color="D3D3D3"/>
+          <w:right w:val="single" w:sz="4" w:space="0" w:color="D3D3D3"/>
+          <w:insideH w:val="single" w:sz="4" w:space="0" w:color="D3D3D3"/>
+          <w:insideV w:val="single" w:sz="4" w:space="0" w:color="D3D3D3"/>
+        </w:tblBorders>
+      </w:tblPr>
+      <w:tblGrid>
+        <w:gridCol w:w="3120"/>
+        <w:gridCol w:w="3120"/>
+        <w:gridCol w:w="3120"/>
+      </w:tblGrid>
+      <w:tr>
+        <w:tc>
+          <w:tcPr>
+            <w:tcW w:type="dxa" w:w="3120"/>
+            <w:shd w:val="clear" w:color="auto" w:fill="F1F5F9"/>
+            <w:tcMar>
+              <w:top w:w="100" w:type="dxa"/>
+              <w:bottom w:w="100" w:type="dxa"/>
+              <w:left w:w="120" w:type="dxa"/>
+              <w:right w:w="120" w:type="dxa"/>
+            </w:tcMar>
+          </w:tcPr>
+          <w:p>
+            <w:r>
+              <w:rPr>
+                <w:b/>
+              </w:rPr>
+              <w:t>Design Component</w:t>
+            </w:r>
+          </w:p>
+        </w:tc>
+        <w:tc>
+          <w:tcPr>
+            <w:tcW w:type="dxa" w:w="3120"/>
+            <w:shd w:val="clear" w:color="auto" w:fill="F1F5F9"/>
+            <w:tcMar>
+              <w:top w:w="100" w:type="dxa"/>
+              <w:bottom w:w="100" w:type="dxa"/>
+              <w:left w:w="120" w:type="dxa"/>
+              <w:right w:w="120" w:type="dxa"/>
+            </w:tcMar>
+          </w:tcPr>
+          <w:p>
+            <w:r>
+              <w:rPr>
+                <w:b/>
+              </w:rPr>
+              <w:t>Specification Details</w:t>
+            </w:r>
+          </w:p>
+        </w:tc>
+        <w:tc>
+          <w:tcPr>
+            <w:tcW w:type="dxa" w:w="3120"/>
+            <w:shd w:val="clear" w:color="auto" w:fill="F1F5F9"/>
+            <w:tcMar>
+              <w:top w:w="100" w:type="dxa"/>
+              <w:bottom w:w="100" w:type="dxa"/>
+              <w:left w:w="120" w:type="dxa"/>
+              <w:right w:w="120" w:type="dxa"/>
+            </w:tcMar>
+          </w:tcPr>
+          <w:p>
+            <w:r>
+              <w:rPr>
+                <w:b/>
+              </w:rPr>
+              <w:t>Rationale &amp; Visual Impact</w:t>
+            </w:r>
+          </w:p>
+        </w:tc>
+      </w:tr>
+      <w:tr>
+        <w:tc>
+          <w:tcPr>
+            <w:tcW w:type="dxa" w:w="3120"/>
+            <w:tcMar>
+              <w:top w:w="80" w:type="dxa"/>
+              <w:bottom w:w="80" w:type="dxa"/>
+              <w:left w:w="100" w:type="dxa"/>
+              <w:right w:w="100" w:type="dxa"/>
+            </w:tcMar>
+          </w:tcPr>
+          <w:p>
+            <w:r>
+              <w:t>Typography</w:t>
+            </w:r>
+          </w:p>
+        </w:tc>
+        <w:tc>
+          <w:tcPr>
+            <w:tcW w:type="dxa" w:w="3120"/>
+            <w:tcMar>
+              <w:top w:w="80" w:type="dxa"/>
+              <w:bottom w:w="80" w:type="dxa"/>
+              <w:left w:w="100" w:type="dxa"/>
+              <w:right w:w="100" w:type="dxa"/>
+            </w:tcMar>
+          </w:tcPr>
+          <w:p>
+            <w:r>
+              <w:t>Outfit Font Family (Main UI)</w:t>
+              <w:br/>
+              <w:t>Noto Sans Devanagari (Hindi)</w:t>
+            </w:r>
+          </w:p>
+        </w:tc>
+        <w:tc>
+          <w:tcPr>
+            <w:tcW w:type="dxa" w:w="3120"/>
+            <w:tcMar>
+              <w:top w:w="80" w:type="dxa"/>
+              <w:bottom w:w="80" w:type="dxa"/>
+              <w:left w:w="100" w:type="dxa"/>
+              <w:right w:w="100" w:type="dxa"/>
+            </w:tcMar>
+          </w:tcPr>
+          <w:p>
+            <w:r>
+              <w:t>Modern geometric styling combined with high-legibility Unicode rendering for bilingual Indian Govt compliance.</w:t>
+            </w:r>
+          </w:p>
+        </w:tc>
+      </w:tr>
+      <w:tr>
+        <w:tc>
+          <w:tcPr>
+            <w:tcW w:type="dxa" w:w="3120"/>
+            <w:tcMar>
+              <w:top w:w="80" w:type="dxa"/>
+              <w:bottom w:w="80" w:type="dxa"/>
+              <w:left w:w="100" w:type="dxa"/>
+              <w:right w:w="100" w:type="dxa"/>
+            </w:tcMar>
+          </w:tcPr>
+          <w:p>
+            <w:r>
+              <w:t>Color Palette</w:t>
+            </w:r>
+          </w:p>
+        </w:tc>
+        <w:tc>
+          <w:tcPr>
+            <w:tcW w:type="dxa" w:w="3120"/>
+            <w:tcMar>
+              <w:top w:w="80" w:type="dxa"/>
+              <w:bottom w:w="80" w:type="dxa"/>
+              <w:left w:w="100" w:type="dxa"/>
+              <w:right w:w="100" w:type="dxa"/>
+            </w:tcMar>
+          </w:tcPr>
+          <w:p>
+            <w:r>
+              <w:t>Primary: Navy (#1e3a8a)</w:t>
+              <w:br/>
+              <w:t>Secondary: Saffron (#ff9933)</w:t>
+              <w:br/>
+              <w:t>Success: Green (#16a34a)</w:t>
+              <w:br/>
+              <w:t>Theme: HSL &amp; Radial Backgrounds</w:t>
+            </w:r>
+          </w:p>
+        </w:tc>
+        <w:tc>
+          <w:tcPr>
+            <w:tcW w:type="dxa" w:w="3120"/>
+            <w:tcMar>
+              <w:top w:w="80" w:type="dxa"/>
+              <w:bottom w:w="80" w:type="dxa"/>
+              <w:left w:w="100" w:type="dxa"/>
+              <w:right w:w="100" w:type="dxa"/>
+            </w:tcMar>
+          </w:tcPr>
+          <w:p>
+            <w:r>
+              <w:t>Evokes trust, national identity, and clear status states, utilizing CSS variables that adjust dynamically to Dark Mode.</w:t>
+            </w:r>
+          </w:p>
+        </w:tc>
+      </w:tr>
+      <w:tr>
+        <w:tc>
+          <w:tcPr>
+            <w:tcW w:type="dxa" w:w="3120"/>
+            <w:tcMar>
+              <w:top w:w="80" w:type="dxa"/>
+              <w:bottom w:w="80" w:type="dxa"/>
+              <w:left w:w="100" w:type="dxa"/>
+              <w:right w:w="100" w:type="dxa"/>
+            </w:tcMar>
+          </w:tcPr>
+          <w:p>
+            <w:r>
+              <w:t>Glassmorphism styling</w:t>
+            </w:r>
+          </w:p>
+        </w:tc>
+        <w:tc>
+          <w:tcPr>
+            <w:tcW w:type="dxa" w:w="3120"/>
+            <w:tcMar>
+              <w:top w:w="80" w:type="dxa"/>
+              <w:bottom w:w="80" w:type="dxa"/>
+              <w:left w:w="100" w:type="dxa"/>
+              <w:right w:w="100" w:type="dxa"/>
+            </w:tcMar>
+          </w:tcPr>
+          <w:p>
+            <w:r>
+              <w:t>Translucent overlays (var(--glass)), border-radius (24px), backdrop-filter (blur(16px)), shadow overlays.</w:t>
+            </w:r>
+          </w:p>
+        </w:tc>
+        <w:tc>
+          <w:tcPr>
+            <w:tcW w:type="dxa" w:w="3120"/>
+            <w:tcMar>
+              <w:top w:w="80" w:type="dxa"/>
+              <w:bottom w:w="80" w:type="dxa"/>
+              <w:left w:w="100" w:type="dxa"/>
+              <w:right w:w="100" w:type="dxa"/>
+            </w:tcMar>
+          </w:tcPr>
+          <w:p>
+            <w:r>
+              <w:t>Imparts a premium, clean look that structures floating information panels without visual clutter or solid borders.</w:t>
+            </w:r>
+          </w:p>
+        </w:tc>
+      </w:tr>
+      <w:tr>
+        <w:tc>
+          <w:tcPr>
+            <w:tcW w:type="dxa" w:w="3120"/>
+            <w:tcMar>
+              <w:top w:w="80" w:type="dxa"/>
+              <w:bottom w:w="80" w:type="dxa"/>
+              <w:left w:w="100" w:type="dxa"/>
+              <w:right w:w="100" w:type="dxa"/>
+            </w:tcMar>
+          </w:tcPr>
+          <w:p>
+            <w:r>
+              <w:t>Responsive Breakpoints</w:t>
+            </w:r>
+          </w:p>
+        </w:tc>
+        <w:tc>
+          <w:tcPr>
+            <w:tcW w:type="dxa" w:w="3120"/>
+            <w:tcMar>
+              <w:top w:w="80" w:type="dxa"/>
+              <w:bottom w:w="80" w:type="dxa"/>
+              <w:left w:w="100" w:type="dxa"/>
+              <w:right w:w="100" w:type="dxa"/>
+            </w:tcMar>
+          </w:tcPr>
+          <w:p>
+            <w:r>
+              <w:t>Desktop layout-wrapper, mobile sidebar drawer at max-width: 1024px, stacked grids at 768px/576px.</w:t>
+            </w:r>
+          </w:p>
+        </w:tc>
+        <w:tc>
+          <w:tcPr>
+            <w:tcW w:type="dxa" w:w="3120"/>
+            <w:tcMar>
+              <w:top w:w="80" w:type="dxa"/>
+              <w:bottom w:w="80" w:type="dxa"/>
+              <w:left w:w="100" w:type="dxa"/>
+              <w:right w:w="100" w:type="dxa"/>
+            </w:tcMar>
+          </w:tcPr>
+          <w:p>
+            <w:r>
+              <w:t>Guarantees adaptive fluid grids and padding adjustments across shipping terminals, tablet systems, and smartphone screens.</w:t>
+            </w:r>
+          </w:p>
+        </w:tc>
+      </w:tr>
+      <w:tr>
+        <w:tc>
+          <w:tcPr>
+            <w:tcW w:type="dxa" w:w="3120"/>
+            <w:tcMar>
+              <w:top w:w="80" w:type="dxa"/>
+              <w:bottom w:w="80" w:type="dxa"/>
+              <w:left w:w="100" w:type="dxa"/>
+              <w:right w:w="100" w:type="dxa"/>
+            </w:tcMar>
+          </w:tcPr>
+          <w:p>
+            <w:r>
+              <w:t>Modal Card Overrides</w:t>
+            </w:r>
+          </w:p>
+        </w:tc>
+        <w:tc>
+          <w:tcPr>
+            <w:tcW w:type="dxa" w:w="3120"/>
+            <w:tcMar>
+              <w:top w:w="80" w:type="dxa"/>
+              <w:bottom w:w="80" w:type="dxa"/>
+              <w:left w:w="100" w:type="dxa"/>
+              <w:right w:w="100" w:type="dxa"/>
+            </w:tcMar>
+          </w:tcPr>
+          <w:p>
+            <w:r>
+              <w:t>Padding: 2.5rem (Desktop) -&gt; 1.75rem (768px) -&gt; 1.25rem (576px);</w:t>
+              <w:br/>
+              <w:t>Radius: 24px -&gt; 20px -&gt; 16px;</w:t>
+              <w:br/>
+              <w:t>Max-height: 90vh to 95vh.</w:t>
+            </w:r>
+          </w:p>
+        </w:tc>
+        <w:tc>
+          <w:tcPr>
+            <w:tcW w:type="dxa" w:w="3120"/>
+            <w:tcMar>
+              <w:top w:w="80" w:type="dxa"/>
+              <w:bottom w:w="80" w:type="dxa"/>
+              <w:left w:w="100" w:type="dxa"/>
+              <w:right w:w="100" w:type="dxa"/>
+            </w:tcMar>
+          </w:tcPr>
+          <w:p>
+            <w:r>
+              <w:t>Ensures pop-ups and clearance review sheets fit comfortably into small smartphone screens without cutting off action keys.</w:t>
+            </w:r>
+          </w:p>
+        </w:tc>
+      </w:tr>
+    </w:tbl>
+    <w:p>
+      <w:pPr>
+        <w:spacing w:before="160"/>
+      </w:pPr>
+    </w:p>
+    <w:p>
       <w:r>
         <w:br w:type="page"/>
       </w:r>
@@ -5175,6 +5883,96 @@
       <w:pPr>
         <w:spacing w:before="120" w:after="120" w:line="240" w:lineRule="auto"/>
       </w:pPr>
+    </w:p>
+    <w:p>
+      <w:pPr>
+        <w:pStyle w:val="Heading2"/>
+        <w:keepNext/>
+        <w:spacing w:before="280" w:after="120"/>
+      </w:pPr>
+      <w:r>
+        <w:rPr>
+          <w:rFonts w:ascii="Calibri" w:hAnsi="Calibri"/>
+          <w:b/>
+          <w:color w:val="0F766E"/>
+          <w:sz w:val="28"/>
+        </w:rPr>
+        <w:t>6.5 Real-Time Dashboards &amp; Port Analytics</w:t>
+      </w:r>
+    </w:p>
+    <w:p>
+      <w:pPr>
+        <w:spacing w:after="160" w:line="276" w:lineRule="auto"/>
+      </w:pPr>
+      <w:r>
+        <w:rPr>
+          <w:rFonts w:ascii="Calibri" w:hAnsi="Calibri"/>
+          <w:color w:val="2D3748"/>
+          <w:sz w:val="22"/>
+        </w:rPr>
+        <w:t>To provide high-density operational metrics for port supervisors, the application integrates real-time data visualization and context syncing modules. Key implementation details include:</w:t>
+      </w:r>
+    </w:p>
+    <w:p>
+      <w:pPr>
+        <w:spacing w:after="160" w:line="276" w:lineRule="auto"/>
+      </w:pPr>
+      <w:r>
+        <w:rPr>
+          <w:rFonts w:ascii="Calibri" w:hAnsi="Calibri"/>
+          <w:color w:val="2D3748"/>
+          <w:sz w:val="22"/>
+        </w:rPr>
+        <w:t>• Dynamic SVG Charts: Rather than including bulky charting libraries, the dashboard utilizes lightweight, responsive SVGs. A SVG Clearance Status Bar and Cargo Volume Line Chart read the MongoDB journey states directly, calculating coordinate points dynamically and transitioning paths smoothly via CSS animations.</w:t>
+        <w:br/>
+        <w:t>• Marine Weather &amp; Tide Syncer: Integrates simulated weather feed widgets displaying wind speed, wave height, and low/high tide schedules specific to the New Mangalore coastline, allowing controllers to make informed berth assignment decisions.</w:t>
+        <w:br/>
+        <w:t>• Environmental Carbon Footprint Calculator: Ships registering voyages automatically compute their estimated CO2 emissions based on cargo weight (GRT/NRT), vessel type, and voyage distance, providing environmental footprint indicators directly on the agent desk.</w:t>
+      </w:r>
+    </w:p>
+    <w:p>
+      <w:pPr>
+        <w:pStyle w:val="Heading2"/>
+        <w:keepNext/>
+        <w:spacing w:before="280" w:after="120"/>
+      </w:pPr>
+      <w:r>
+        <w:rPr>
+          <w:rFonts w:ascii="Calibri" w:hAnsi="Calibri"/>
+          <w:b/>
+          <w:color w:val="0F766E"/>
+          <w:sz w:val="28"/>
+        </w:rPr>
+        <w:t>6.6 Recent UI &amp; Security Enhancements</w:t>
+      </w:r>
+    </w:p>
+    <w:p>
+      <w:pPr>
+        <w:spacing w:after="160" w:line="276" w:lineRule="auto"/>
+      </w:pPr>
+      <w:r>
+        <w:rPr>
+          <w:rFonts w:ascii="Calibri" w:hAnsi="Calibri"/>
+          <w:color w:val="2D3748"/>
+          <w:sz w:val="22"/>
+        </w:rPr>
+        <w:t>Based on operational reviews, the following system refinements were implemented:</w:t>
+      </w:r>
+    </w:p>
+    <w:p>
+      <w:pPr>
+        <w:spacing w:after="160" w:line="276" w:lineRule="auto"/>
+      </w:pPr>
+      <w:r>
+        <w:rPr>
+          <w:rFonts w:ascii="Calibri" w:hAnsi="Calibri"/>
+          <w:color w:val="2D3748"/>
+          <w:sz w:val="22"/>
+        </w:rPr>
+        <w:t>1. Compliant SMS Toaster Alerts: Adds a notification service toast alert simulating cellular SMS delivery when clearance approvals or rejections are finalized. Following privacy protocols, direct phone number references are omitted from the notification panels to ensure data safety.</w:t>
+        <w:br/>
+        <w:t>2. Seeding of Pre-Approved Role credentials: The system database initialization script pre-populates default accounts for all roles (e.g. Health Officer, Customs Assistant Commissioner, Traffic Superintendent, Ship Agent) enabling rapid academic testing and verification of multi-department stepper flows.</w:t>
+      </w:r>
     </w:p>
     <w:p>
       <w:r>

</xml_diff>